<commit_message>
Adicionando a imagem que estava faltando
</commit_message>
<xml_diff>
--- a/Documentacao_de_Projeto_ChessMate.docx
+++ b/Documentacao_de_Projeto_ChessMate.docx
@@ -2866,7 +2866,7 @@
       <w:r>
         <w:drawing>
           <wp:inline>
-            <wp:extent cx="5806440" cy="2994901"/>
+            <wp:extent cx="4102920" cy="6629400"/>
             <wp:docPr id="4" name="Picture 4"/>
             <wp:cNvGraphicFramePr>
               <a:graphicFrameLocks noChangeAspect="1"/>
@@ -2887,7 +2887,7 @@
                   <pic:spPr>
                     <a:xfrm>
                       <a:off x="0" y="0"/>
-                      <a:ext cx="5806440" cy="2994901"/>
+                      <a:ext cx="4102920" cy="6629400"/>
                     </a:xfrm>
                     <a:prstGeom prst="rect"/>
                   </pic:spPr>
@@ -5405,7 +5405,7 @@
         <w:vertAlign w:val="baseline"/>
         <w:rtl w:val="0"/>
       </w:rPr>
-      <w:t xml:space="preserve">Documentação de Projeto para o Sistema &lt;nome do sistema&gt; Página  </w:t>
+      <w:t xml:space="preserve">Documentação de Projeto para o Sistema ChessMate Página  </w:t>
     </w:r>
     <w:r>
       <w:rPr>
@@ -5527,7 +5527,7 @@
         <w:vertAlign w:val="baseline"/>
         <w:rtl w:val="0"/>
       </w:rPr>
-      <w:t xml:space="preserve">Documentação de Projeto para o Sistema &lt;nome do sistema&gt; Página </w:t>
+      <w:t xml:space="preserve">Documentação de Projeto para o Sistema ChessMate Página </w:t>
       <w:tab/>
       <w:tab/>
     </w:r>

</xml_diff>